<commit_message>
revue de litterature PPC
</commit_message>
<xml_diff>
--- a/Projet Thèse/Revue littérature.docx
+++ b/Projet Thèse/Revue littérature.docx
@@ -1103,6 +1103,486 @@
       </w:pPr>
       <w:r>
         <w:rPr/>
+      </w:r>
+    </w:p>
+    <w:p>
+      <w:pPr>
+        <w:pStyle w:val="Normal"/>
+        <w:bidi w:val="0"/>
+        <w:jc w:val="start"/>
+        <w:rPr/>
+      </w:pPr>
+      <w:r>
+        <w:rPr/>
+        <w:t>- H Bruns, Grischa Perino : « </w:t>
+      </w:r>
+      <w:r>
+        <w:rPr>
+          <w:rFonts w:eastAsia="NSimSun" w:cs="Lucida Sans"/>
+          <w:b/>
+          <w:bCs/>
+          <w:color w:val="auto"/>
+          <w:kern w:val="2"/>
+          <w:sz w:val="24"/>
+          <w:szCs w:val="24"/>
+          <w:lang w:val="fr-FR" w:eastAsia="zh-CN" w:bidi="hi-IN"/>
+        </w:rPr>
+        <w:t>The role of autonomy and reactance for nudging — Experimentally comparing defaults to recommendations and mandates</w:t>
+      </w:r>
+      <w:r>
+        <w:rPr/>
+        <w:t xml:space="preserve"> » : </w:t>
+      </w:r>
+      <w:r>
+        <w:rPr/>
+        <w:t>Un article sur un expérience permettant de mettre en avant que les différents niveaux de politiques publiques sont biens perçus différemment par les gens. Cela justifie bien l’existence d’une variable (n) sur le niveau de perception de l’intensité d’une politique publique.</w:t>
+      </w:r>
+    </w:p>
+    <w:p>
+      <w:pPr>
+        <w:pStyle w:val="Normal"/>
+        <w:bidi w:val="0"/>
+        <w:jc w:val="start"/>
+        <w:rPr/>
+      </w:pPr>
+      <w:r>
+        <w:rPr/>
+      </w:r>
+    </w:p>
+    <w:p>
+      <w:pPr>
+        <w:pStyle w:val="Normal"/>
+        <w:bidi w:val="0"/>
+        <w:jc w:val="start"/>
+        <w:rPr/>
+      </w:pPr>
+      <w:r>
+        <w:rPr/>
+        <w:t xml:space="preserve">- </w:t>
+      </w:r>
+      <w:r>
+        <w:rPr/>
+        <w:t>B. D. Rosenberg, J. T. Siegel : « </w:t>
+      </w:r>
+      <w:r>
+        <w:rPr>
+          <w:rFonts w:eastAsia="NSimSun" w:cs="Lucida Sans"/>
+          <w:b/>
+          <w:bCs/>
+          <w:color w:val="auto"/>
+          <w:kern w:val="2"/>
+          <w:sz w:val="24"/>
+          <w:szCs w:val="24"/>
+          <w:lang w:val="fr-FR" w:eastAsia="zh-CN" w:bidi="hi-IN"/>
+        </w:rPr>
+        <w:t>Psychological Reactance Theory: An Introduction and Overview</w:t>
+      </w:r>
+      <w:r>
+        <w:rPr/>
+        <w:t xml:space="preserve"> » : </w:t>
+      </w:r>
+      <w:r>
+        <w:rPr/>
+        <w:t>Revue de littérature sur le concept de Reactance.</w:t>
+      </w:r>
+    </w:p>
+    <w:p>
+      <w:pPr>
+        <w:pStyle w:val="Normal"/>
+        <w:bidi w:val="0"/>
+        <w:jc w:val="start"/>
+        <w:rPr/>
+      </w:pPr>
+      <w:r>
+        <w:rPr/>
+      </w:r>
+    </w:p>
+    <w:p>
+      <w:pPr>
+        <w:pStyle w:val="Normal"/>
+        <w:bidi w:val="0"/>
+        <w:jc w:val="start"/>
+        <w:rPr/>
+      </w:pPr>
+      <w:r>
+        <w:rPr/>
+        <w:t xml:space="preserve">- </w:t>
+      </w:r>
+      <w:r>
+        <w:rPr/>
+        <w:t xml:space="preserve">N. Boissonnet, A. </w:t>
+      </w:r>
+      <w:r>
+        <w:rPr/>
+        <w:t>GHERSENGORIN : « </w:t>
+      </w:r>
+      <w:r>
+        <w:rPr>
+          <w:rFonts w:eastAsia="NSimSun" w:cs="Lucida Sans"/>
+          <w:b/>
+          <w:bCs/>
+          <w:color w:val="auto"/>
+          <w:kern w:val="2"/>
+          <w:sz w:val="24"/>
+          <w:szCs w:val="24"/>
+          <w:lang w:val="fr-FR" w:eastAsia="zh-CN" w:bidi="hi-IN"/>
+        </w:rPr>
+        <w:t>GRABBING THE FORBIDDEN FRUIT: RESTRICTION-SENSITIVE CHOICE</w:t>
+      </w:r>
+      <w:r>
+        <w:rPr/>
+        <w:t xml:space="preserve"> » : </w:t>
+      </w:r>
+      <w:r>
+        <w:rPr/>
+        <w:t>Un modèle qui vient représenter l’effet qui pousse les gens à faire une chose si celle-ci est interdite. C’est un effet backlash des politiques publiques qui reprend la théorie de la Réactance. Il parle de l’inverse de mon modèle mais reste intéressant à étudier.</w:t>
+      </w:r>
+    </w:p>
+    <w:p>
+      <w:pPr>
+        <w:pStyle w:val="Normal"/>
+        <w:bidi w:val="0"/>
+        <w:jc w:val="start"/>
+        <w:rPr/>
+      </w:pPr>
+      <w:r>
+        <w:rPr/>
+      </w:r>
+    </w:p>
+    <w:p>
+      <w:pPr>
+        <w:pStyle w:val="Normal"/>
+        <w:bidi w:val="0"/>
+        <w:jc w:val="start"/>
+        <w:rPr/>
+      </w:pPr>
+      <w:r>
+        <w:rPr/>
+        <w:t xml:space="preserve"> </w:t>
+      </w:r>
+    </w:p>
+    <w:p>
+      <w:pPr>
+        <w:pStyle w:val="Normal"/>
+        <w:bidi w:val="0"/>
+        <w:jc w:val="start"/>
+        <w:rPr/>
+      </w:pPr>
+      <w:r>
+        <w:rPr/>
+        <w:t xml:space="preserve">- </w:t>
+      </w:r>
+      <w:r>
+        <w:rPr/>
+        <w:t>M. Bertini, A. Aydinli : « </w:t>
+      </w:r>
+      <w:r>
+        <w:rPr>
+          <w:rFonts w:eastAsia="NSimSun" w:cs="Lucida Sans"/>
+          <w:b/>
+          <w:bCs/>
+          <w:color w:val="auto"/>
+          <w:kern w:val="2"/>
+          <w:sz w:val="24"/>
+          <w:szCs w:val="24"/>
+          <w:lang w:val="fr-FR" w:eastAsia="zh-CN" w:bidi="hi-IN"/>
+        </w:rPr>
+        <w:t>Consumer Reactance to Promotional Favors</w:t>
+      </w:r>
+      <w:r>
+        <w:rPr/>
+        <w:t xml:space="preserve"> » : </w:t>
+      </w:r>
+      <w:r>
+        <w:rPr/>
+        <w:t>Dans cet article, les auteurs mettent en avant le fait qu’une promotion accessible via une contrepartie non monétaire se confronte aussi avec une réactance des consommateurs. Ils testent cette hypothèse au travers de plusieurs expériences (1 de terrain et 4 en laboratoire). Ceci permet de justifier le coût qu’une action a pour un agent. Dans mon modèle, le fait de devoir faire une action supplémentaire peut réveiller une part de la réactance. Du coût, la réactance est liée au coût d’une action.</w:t>
+      </w:r>
+    </w:p>
+    <w:p>
+      <w:pPr>
+        <w:pStyle w:val="Normal"/>
+        <w:bidi w:val="0"/>
+        <w:jc w:val="start"/>
+        <w:rPr/>
+      </w:pPr>
+      <w:r>
+        <w:rPr/>
+      </w:r>
+    </w:p>
+    <w:p>
+      <w:pPr>
+        <w:pStyle w:val="Normal"/>
+        <w:bidi w:val="0"/>
+        <w:jc w:val="start"/>
+        <w:rPr/>
+      </w:pPr>
+      <w:r>
+        <w:rPr/>
+        <w:t>- W. Schnedler, C. Vanberg : « </w:t>
+      </w:r>
+      <w:r>
+        <w:rPr>
+          <w:rFonts w:eastAsia="NSimSun" w:cs="Lucida Sans"/>
+          <w:b/>
+          <w:bCs/>
+          <w:color w:val="auto"/>
+          <w:kern w:val="2"/>
+          <w:sz w:val="24"/>
+          <w:szCs w:val="24"/>
+          <w:lang w:val="fr-FR" w:eastAsia="zh-CN" w:bidi="hi-IN"/>
+        </w:rPr>
+        <w:t>Playing 'Hard to Get': An Economic Rationale for Crowding Out of Intrinsically Motivated Behavior</w:t>
+      </w:r>
+      <w:r>
+        <w:rPr/>
+        <w:t> » :!W</w:t>
+      </w:r>
+      <w:r>
+        <w:rPr/>
+        <w:t>ORKING PAPER ! Dans ce papier les auteurs parlent du fait que l’ajout d’une récompense sur une activité que les agents font déjà naturellement pour le plaisir peut avoir un effet de crowding out et entrainer une forme de réactance. C’est une façon supplémentaire de justifier que la réactance existe tout le temps mais aussi que l’usage d’une politique publique impacte celle ci même si elle apporte plus aux agents que si elle n’existait pas. On justifie notre réactance mais aussi notre variable n.</w:t>
+      </w:r>
+    </w:p>
+    <w:p>
+      <w:pPr>
+        <w:pStyle w:val="Normal"/>
+        <w:bidi w:val="0"/>
+        <w:jc w:val="start"/>
+        <w:rPr/>
+      </w:pPr>
+      <w:r>
+        <w:rPr/>
+      </w:r>
+    </w:p>
+    <w:p>
+      <w:pPr>
+        <w:pStyle w:val="Normal"/>
+        <w:bidi w:val="0"/>
+        <w:jc w:val="start"/>
+        <w:rPr/>
+      </w:pPr>
+      <w:r>
+        <w:rPr/>
+      </w:r>
+    </w:p>
+    <w:p>
+      <w:pPr>
+        <w:pStyle w:val="Normal"/>
+        <w:bidi w:val="0"/>
+        <w:jc w:val="start"/>
+        <w:rPr/>
+      </w:pPr>
+      <w:r>
+        <w:rPr/>
+        <w:t xml:space="preserve">- </w:t>
+      </w:r>
+      <w:r>
+        <w:rPr/>
+        <w:t>J. P. Dillard, L. Shen : « </w:t>
+      </w:r>
+      <w:r>
+        <w:rPr>
+          <w:rFonts w:eastAsia="NSimSun" w:cs="Lucida Sans"/>
+          <w:b/>
+          <w:bCs/>
+          <w:color w:val="auto"/>
+          <w:kern w:val="2"/>
+          <w:sz w:val="24"/>
+          <w:szCs w:val="24"/>
+          <w:lang w:val="fr-FR" w:eastAsia="zh-CN" w:bidi="hi-IN"/>
+        </w:rPr>
+        <w:t>On the Nature of Reactance and its Role in Persuasive Health Communication</w:t>
+      </w:r>
+      <w:r>
+        <w:rPr/>
+        <w:t xml:space="preserve"> » : </w:t>
+      </w:r>
+      <w:r>
+        <w:rPr/>
+        <w:t>Dans ce papier les auteurs tests des campagnes sur la santé sur des personnes choisies afin de voir s’il est possible de mesurer la réactance. Il regarde aussi, à l’aide de questionnaire, ce qui provoque la réactance. Alors que Brehm soutenait que la réactance ne pouvait pas être mesurée, les auteurs prouvent qu’il est possible de l’évaluer. Ils montrent aussi que le type de message envoyé et les canaux utilisés ont un impact sur la part des agents testés qui réagissent à la campagne. On justifie ici l’existence même du modèle ainsi que n.</w:t>
+      </w:r>
+    </w:p>
+    <w:p>
+      <w:pPr>
+        <w:pStyle w:val="Normal"/>
+        <w:bidi w:val="0"/>
+        <w:jc w:val="start"/>
+        <w:rPr/>
+      </w:pPr>
+      <w:r>
+        <w:rPr/>
+      </w:r>
+    </w:p>
+    <w:p>
+      <w:pPr>
+        <w:pStyle w:val="Normal"/>
+        <w:bidi w:val="0"/>
+        <w:jc w:val="start"/>
+        <w:rPr/>
+      </w:pPr>
+      <w:r>
+        <w:rPr/>
+        <w:t xml:space="preserve">- </w:t>
+      </w:r>
+      <w:r>
+        <w:rPr/>
+        <w:t>A. Ma, S. Tang, A. C. Kay : « </w:t>
+      </w:r>
+      <w:r>
+        <w:rPr>
+          <w:rFonts w:eastAsia="NSimSun" w:cs="Lucida Sans"/>
+          <w:b/>
+          <w:bCs/>
+          <w:color w:val="auto"/>
+          <w:kern w:val="2"/>
+          <w:sz w:val="24"/>
+          <w:szCs w:val="24"/>
+          <w:lang w:val="fr-FR" w:eastAsia="zh-CN" w:bidi="hi-IN"/>
+        </w:rPr>
+        <w:t>Psychological reactance as a function of thought versus behavioral control</w:t>
+      </w:r>
+      <w:r>
+        <w:rPr/>
+        <w:t xml:space="preserve"> » : </w:t>
+      </w:r>
+      <w:r>
+        <w:rPr/>
+        <w:t>Dans cet article les auteurs tests au cours d’expériences différents types de contrôles appliqués sur les agents. Ils partent de l’hypothèse que les nouveaux moyens s’appuient de plus en plus sur le contrôle de ce que les gens pensent pour modifier le comportement plutôt que de conduire leur comportement directement. Ils trouvent que les agents ressentent plus la tentative de contrôle dans le premier cas et se montrent plus hostiles ou plus prudents. Cet article nous permet de justifier de l’intérêt de mettre en place un modèle prédictif permettant d’évaluer les méthode de campagnes et d’en déduire un niveau de réactance dans la population. Il justifie aussi l’existence de la variable n comme perception de l’intensité d’une politique publique.</w:t>
+      </w:r>
+    </w:p>
+    <w:p>
+      <w:pPr>
+        <w:pStyle w:val="Normal"/>
+        <w:bidi w:val="0"/>
+        <w:jc w:val="start"/>
+        <w:rPr/>
+      </w:pPr>
+      <w:r>
+        <w:rPr/>
+      </w:r>
+    </w:p>
+    <w:p>
+      <w:pPr>
+        <w:pStyle w:val="Normal"/>
+        <w:bidi w:val="0"/>
+        <w:jc w:val="start"/>
+        <w:rPr/>
+      </w:pPr>
+      <w:r>
+        <w:rPr/>
+        <w:t>- G. J. Fitzsimons, D. R. Lehmann : « </w:t>
+      </w:r>
+      <w:r>
+        <w:rPr>
+          <w:rFonts w:eastAsia="NSimSun" w:cs="Lucida Sans"/>
+          <w:b/>
+          <w:bCs/>
+          <w:color w:val="auto"/>
+          <w:kern w:val="2"/>
+          <w:sz w:val="24"/>
+          <w:szCs w:val="24"/>
+          <w:lang w:val="fr-FR" w:eastAsia="zh-CN" w:bidi="hi-IN"/>
+        </w:rPr>
+        <w:t>Reactance to Recommendations: When Unsolicited Advice Yields Contrary Responses</w:t>
+      </w:r>
+      <w:r>
+        <w:rPr/>
+        <w:t xml:space="preserve"> »: </w:t>
+      </w:r>
+      <w:r>
+        <w:rPr/>
+        <w:t>Dans cet article, les auteurs montrent qu’une recommandation dans un contexte où celle-ci n’était pas attendue, a un effet contre productif. Les agents sentent une tentative de contrôle et sont plus réactant. Cet article justifie une fois de plus l’intérêt du modèle et la relation entre la forme de la politique publique et la réactance.</w:t>
+      </w:r>
+    </w:p>
+    <w:p>
+      <w:pPr>
+        <w:pStyle w:val="Normal"/>
+        <w:bidi w:val="0"/>
+        <w:jc w:val="start"/>
+        <w:rPr/>
+      </w:pPr>
+      <w:r>
+        <w:rPr/>
+      </w:r>
+    </w:p>
+    <w:p>
+      <w:pPr>
+        <w:pStyle w:val="Normal"/>
+        <w:bidi w:val="0"/>
+        <w:jc w:val="start"/>
+        <w:rPr/>
+      </w:pPr>
+      <w:r>
+        <w:rPr/>
+        <w:t>- C. Steindl, E. Jonas, S. Sittenthaler, E. Traut-Mattausch, J. Greenberg : « </w:t>
+      </w:r>
+      <w:r>
+        <w:rPr>
+          <w:rFonts w:eastAsia="NSimSun" w:cs="Lucida Sans"/>
+          <w:b/>
+          <w:bCs/>
+          <w:color w:val="auto"/>
+          <w:kern w:val="2"/>
+          <w:sz w:val="24"/>
+          <w:szCs w:val="24"/>
+          <w:lang w:val="fr-FR" w:eastAsia="zh-CN" w:bidi="hi-IN"/>
+        </w:rPr>
+        <w:t>Understanding Psychological Reactance New Developments and Findings</w:t>
+      </w:r>
+      <w:r>
+        <w:rPr/>
+        <w:t xml:space="preserve"> » :  </w:t>
+      </w:r>
+      <w:r>
+        <w:rPr/>
+        <w:t>Cet article est un état des lieux de la recherche sur la réactance 50 ans après le publication de Brehm.</w:t>
+      </w:r>
+    </w:p>
+    <w:p>
+      <w:pPr>
+        <w:pStyle w:val="Normal"/>
+        <w:bidi w:val="0"/>
+        <w:jc w:val="start"/>
+        <w:rPr/>
+      </w:pPr>
+      <w:r>
+        <w:rPr/>
+      </w:r>
+    </w:p>
+    <w:p>
+      <w:pPr>
+        <w:pStyle w:val="Normal"/>
+        <w:bidi w:val="0"/>
+        <w:jc w:val="start"/>
+        <w:rPr/>
+      </w:pPr>
+      <w:r>
+        <w:rPr/>
+        <w:t xml:space="preserve">- </w:t>
+      </w:r>
+      <w:r>
+        <w:rPr/>
+        <w:t>A. Falk, M. Kosfeld : « </w:t>
+      </w:r>
+      <w:r>
+        <w:rPr>
+          <w:rFonts w:eastAsia="NSimSun" w:cs="Lucida Sans"/>
+          <w:b/>
+          <w:bCs/>
+          <w:color w:val="auto"/>
+          <w:kern w:val="2"/>
+          <w:sz w:val="24"/>
+          <w:szCs w:val="24"/>
+          <w:lang w:val="fr-FR" w:eastAsia="zh-CN" w:bidi="hi-IN"/>
+        </w:rPr>
+        <w:t>The hidden costs of control</w:t>
+      </w:r>
+      <w:r>
+        <w:rPr/>
+        <w:t xml:space="preserve"> » : </w:t>
+      </w:r>
+      <w:r>
+        <w:rPr/>
+        <w:t xml:space="preserve">Dans cet article les auteurs montrent comment une tentative de contrôle sur des agents peut les rendre moins productifs et baisser leur motivation. Au cours d’expériences, ils constatent que les agents averses aux contrôle baissent leur productivité dès qu’une autre agent tente de leur imposer un minimum. Cet article parle pour la première fois de la motivation. Dans ce cadre, celle-ci est diminuer par le contrôle et le contrôle est donc vu comme un élément de réactance. Cela justifie certes, la présence de n dans l’équation mais me fait me poser des questions sur l’équation entière : celle ci ne devrait-elle pas donner la motivation par agent ? Est-ce que la motivation est un élément à mettre en face de la réactance ou la réactance à introduire dans la motivation ? </w:t>
       </w:r>
     </w:p>
     <w:sectPr>

</xml_diff>